<commit_message>
Claudinho: revisão da Parte 3
Co-Authored-By: Claude Opus 5.5 <noreply@anthropic.com>
Claude-Session: https://claude.ai/code/session_01MJjUEEZrxQDEUifKK2vj9g
</commit_message>
<xml_diff>
--- a/roteiros/claudinho/Claudinho_Parte3.docx
+++ b/roteiros/claudinho/Claudinho_Parte3.docx
@@ -31,7 +31,7 @@
         <w:rPr>
           <w:color w:val="000000"/>
         </w:rPr>
-        <w:t>Os dois estavam comendo juntos quando Claudinho falou de uma inquietação que não conseguia explicar. Disse que sentia como se Deus estivesse falando com ele. Que precisava ficar mais perto de Deus. Que queria rezar.</w:t>
+        <w:t>Os dois estavam comendo juntos quando Claudinho falou de uma inquietação que não conseguia explicar. Sentia como se Deus estivesse falando com ele. E queria rezar.</w:t>
       </w:r>
     </w:p>
     <w:p>
@@ -39,7 +39,7 @@
         <w:rPr>
           <w:color w:val="000000"/>
         </w:rPr>
-        <w:t>Buchecha ouviu, estranhou, e a conversa seguiu.</w:t>
+        <w:t>Buchecha ouviu, e a conversa seguiu.</w:t>
       </w:r>
     </w:p>
     <w:p>
@@ -119,7 +119,7 @@
         <w:rPr>
           <w:color w:val="000000"/>
         </w:rPr>
-        <w:t>Naquela noite, Claudinho e Buchecha tinham mais um show da turnê do disco novo. A apresentação era em Lorena, no interior de São Paulo, a quase duzentos quilômetros dali, pela Via Dutra. Uma cidade do Vale do Paraíba, já perto da divisa com o Rio.</w:t>
+        <w:t>Naquela noite, Claudinho e Buchecha tinham mais um show da turnê do disco novo. A apresentação era em Lorena, no interior de São Paulo, a mais de duzentos quilômetros dali, pela Via Dutra. Uma cidade do Vale do Paraíba, já perto da divisa com o Rio.</w:t>
       </w:r>
     </w:p>
     <w:p>
@@ -127,7 +127,7 @@
         <w:rPr>
           <w:color w:val="000000"/>
         </w:rPr>
-        <w:t>Para a dupla, era rotina. Pegar a estrada, cantar, voltar de madrugada.</w:t>
+        <w:t>Para a dupla, era rotina. Pegar a estrada, cantar, voltar de madrugada. Tinham feito isso muitas vezes.</w:t>
       </w:r>
     </w:p>
     <w:p>
@@ -295,7 +295,7 @@
         <w:rPr>
           <w:color w:val="C00000"/>
         </w:rPr>
-        <w:t>Agora, pare um instante e pense no que significa isso. Um homem que não queria ir ao show, que não explicou o motivo, e que mesmo assim decidiu ir. Sozinho, no próprio carro, longe do melhor amigo. Essa foi a escolha que até hoje ninguém consegue explicar. E é ela que coloca Claudinho naquele Golf, horas depois, na estrada da volta.</w:t>
+        <w:t>Agora, pare um instante e pense no que significa isso. Um homem que não queria ir ao show, que não explicou o motivo, e que mesmo assim decidiu ir. No próprio carro, longe do melhor amigo. Essa foi a escolha que até hoje ninguém consegue explicar. E é ela que coloca Claudinho naquele Golf, horas depois, na estrada da volta.</w:t>
       </w:r>
     </w:p>
     <w:p>
@@ -415,7 +415,7 @@
         <w:rPr>
           <w:color w:val="000000"/>
         </w:rPr>
-        <w:t>Choveu durante a noite inteira. A pista estava molhada, escura, escorregadia.</w:t>
+        <w:t>Choveu durante a noite inteira. A pista estava molhada e escorregadia.</w:t>
       </w:r>
     </w:p>
     <w:p>
@@ -447,7 +447,7 @@
         <w:rPr>
           <w:color w:val="000000"/>
         </w:rPr>
-        <w:t>Uma descida longa, com uma curva atrás da outra, cercada de mato e de barrancos. Quem desce a serra vê a pista sumir a cada curva. Um trecho que exige atenção até de motoristas experientes, mesmo com tempo seco.</w:t>
+        <w:t>Uma descida longa, com uma curva atrás da outra, cercada de mato e de barrancos. Quem desce a serra vê a pista sumir a cada curva. Um trecho que exige atenção até de motoristas experientes, mesmo com tempo seco. Dali, a estrada desce em direção à Baixada Fluminense.</w:t>
       </w:r>
     </w:p>
     <w:p>
@@ -471,7 +471,7 @@
         <w:rPr>
           <w:color w:val="000000"/>
         </w:rPr>
-        <w:t>O dia começava a clarear.</w:t>
+        <w:t>O dia começava a clarear. Faltava pouco para o Golf chegar ao Rio.</w:t>
       </w:r>
     </w:p>
     <w:p>
@@ -487,7 +487,7 @@
         <w:rPr>
           <w:color w:val="000000"/>
         </w:rPr>
-        <w:t>Alguns minutos atrás, a van de Buchecha seguia pelo mesmo caminho.</w:t>
+        <w:t>Alguns minutos atrás, a van de Buchecha seguia pelo mesmo caminho. Ninguém dentro dela imaginava o que estava logo à frente.</w:t>
       </w:r>
     </w:p>
     <w:p>
@@ -519,7 +519,7 @@
         <w:rPr>
           <w:color w:val="000000"/>
         </w:rPr>
-        <w:t>Ivan sobreviveu. Ferido, foi levado para o Hospital da Posse, em Nova Iguaçu.</w:t>
+        <w:t>Ivan sobreviveu. Ferido, foi levado para o Hospital da Posse, em Nova Iguaçu, na Baixada Fluminense.</w:t>
       </w:r>
     </w:p>
     <w:p>
@@ -551,7 +551,7 @@
         <w:rPr>
           <w:color w:val="000000"/>
         </w:rPr>
-        <w:t>Buchecha chegou ao local poucos minutos depois, quando o acidente tinha acabado de acontecer. Antes da ambulância. A van parou na beira da pista, e ele desceu correndo.</w:t>
+        <w:t>Buchecha chegou ao local poucos minutos depois, quando o acidente tinha acabado de acontecer. Antes da ambulância.</w:t>
       </w:r>
     </w:p>
     <w:p>
@@ -567,7 +567,7 @@
         <w:rPr>
           <w:color w:val="000000"/>
         </w:rPr>
-        <w:t>O menino que ele conheceu aos sete anos. O parceiro que insistiu até ouvir um sim para formar a dupla. O homem que ele escolheu ser padrinho da filha.</w:t>
+        <w:t>O menino que ele conheceu aos sete anos. O amigo que o escolheu para padrinho da própria filha.</w:t>
       </w:r>
     </w:p>
     <w:p>
@@ -591,7 +591,7 @@
         <w:rPr>
           <w:color w:val="000000"/>
         </w:rPr>
-        <w:t>A turnê do disco Vamos Dançar terminou ali, na Serra das Araras. O último álbum da dupla virou, de uma hora para outra, o disco de despedida de Claudinho.</w:t>
+        <w:t>A turnê do disco Vamos Dançar terminou ali, na Serra das Araras. O último álbum da dupla, lançado naquele mesmo ano, virou de uma hora para outra o disco de despedida de Claudinho.</w:t>
       </w:r>
     </w:p>
     <w:p>
@@ -607,7 +607,7 @@
         <w:rPr>
           <w:color w:val="000000"/>
         </w:rPr>
-        <w:t>Em poucas horas, a notícia se espalhou pelo país. Muita gente acordou naquele sábado e ligou o rádio sem acreditar no que ouvia. As rádios que tocavam Claudinho e Buchecha desde mil novecentos e noventa e cinco agora anunciavam a morte de um dos dois.</w:t>
+        <w:t>Em poucas horas, a notícia se espalhou pelo país. As rádios que tocavam Claudinho e Buchecha desde mil novecentos e noventa e cinco agora anunciavam a morte de um dos dois.</w:t>
       </w:r>
     </w:p>
     <w:p>
@@ -615,7 +615,7 @@
         <w:rPr>
           <w:color w:val="000000"/>
         </w:rPr>
-        <w:t>Anos depois, numa entrevista, Buchecha falou sobre a recusa do amigo naquele dia. Disse acreditar que algumas pessoas sentem quando a morte está chegando.</w:t>
+        <w:t>Anos depois, numa entrevista, Buchecha falou sobre a recusa do amigo naquele dia. Disse acreditar que algumas pessoas sentem quando a morte está chegando. Repetiu essa ideia em mais de um podcast, ao longo dos anos. E voltou a ela em dois mil e vinte e cinco, quando contou sobre os sinais daquela última semana.</w:t>
       </w:r>
     </w:p>
     <w:p>
@@ -639,7 +639,7 @@
         <w:rPr>
           <w:color w:val="C00000"/>
         </w:rPr>
-        <w:t>Só que existe uma parte daquela sexta-feira que Buchecha guardou por quase vinte anos. Uma parte que explica por que, depois da morte do amigo, ele não conseguiu se perdoar. Lembra daquela conversa em que Claudinho dizia que não ia ao show?</w:t>
+        <w:t>Só que existe uma parte daquela sexta-feira que Buchecha guardou por muitos anos. Uma parte que torna aquela madrugada ainda mais pesada para ele. Lembra daquela conversa em que Claudinho dizia que não ia ao show?</w:t>
       </w:r>
     </w:p>
     <w:p>
@@ -655,7 +655,7 @@
         <w:rPr>
           <w:color w:val="1F4EB4"/>
         </w:rPr>
-        <w:t>Claudinho ouviu. E foi. Sozinho, no carro novo, longe do melhor amigo. E nunca mais voltou.</w:t>
+        <w:t>Claudinho ouviu. E foi. No carro novo, longe do melhor amigo. E nunca mais voltou.</w:t>
       </w:r>
     </w:p>
     <w:p>
@@ -663,7 +663,7 @@
         <w:rPr>
           <w:color w:val="000000"/>
         </w:rPr>
-        <w:t>Buchecha contou isso em entrevistas, já adulto, já pai, já com décadas de carreira. Mas o peso daquela insistência caiu sobre ele naquela mesma manhã, na beira da estrada.</w:t>
+        <w:t>Buchecha contou isso em entrevistas, muitos anos depois.</w:t>
       </w:r>
     </w:p>
     <w:p>

</xml_diff>